<commit_message>
Yayın: ekipman adetleri mekanik projeye indirildi
Tünel fanı 7 -> 4 adet/kümes, panjur klapesi 80 -> 40 adet/kümes.
Makine-ekipman tutarı 3.344.220,00 -> 3.095.220,00 TL.

Co-Authored-By: Claude Opus 5 <noreply@anthropic.com>
Claude-Session: https://claude.ai/code/session_01HJPp6bx7wepUX5p8fxGcjg
</commit_message>
<xml_diff>
--- a/belgeler/07_EKIPMAN_TEKNIK_SARTNAMESI.docx
+++ b/belgeler/07_EKIPMAN_TEKNIK_SARTNAMESI.docx
@@ -1501,7 +1501,7 @@
                 <w:sz w:val="24"/>
                 <w:szCs w:val="24"/>
               </w:rPr>
-              <w:t xml:space="preserve">Fan sayısı kümes başına 7 adet, toplam 14 adet olmalıdır.</w:t>
+              <w:t xml:space="preserve">Fan sayısı kümes başına 4 adet, toplam 8 adet olmalıdır.</w:t>
             </w:r>
           </w:p>
           <w:p>
@@ -1825,7 +1825,7 @@
                 <w:sz w:val="24"/>
                 <w:szCs w:val="24"/>
               </w:rPr>
-              <w:t xml:space="preserve">Klape sayısı kümes başına 80 adet, toplam 160 adet olmalıdır.</w:t>
+              <w:t xml:space="preserve">Klape sayısı kümes başına 40 adet, toplam 80 adet olmalıdır.</w:t>
             </w:r>
           </w:p>
           <w:p>

</xml_diff>

<commit_message>
Yayin: tutarlilik denetimi sonrasi paket yenilendi
Kapasite, avro kuru, klape adedi ve evrak sayimlari tek kaynaga baglandi;
kesif ozeti, teklif ve teklif sunum formu degismedi.

Co-Authored-By: Claude Opus 5 <noreply@anthropic.com>
Claude-Session: https://claude.ai/code/session_01HJPp6bx7wepUX5p8fxGcjg
</commit_message>
<xml_diff>
--- a/belgeler/07_EKIPMAN_TEKNIK_SARTNAMESI.docx
+++ b/belgeler/07_EKIPMAN_TEKNIK_SARTNAMESI.docx
@@ -1712,7 +1712,7 @@
                 <w:sz w:val="24"/>
                 <w:szCs w:val="24"/>
               </w:rPr>
-              <w:t xml:space="preserve">14</w:t>
+              <w:t xml:space="preserve">8</w:t>
             </w:r>
           </w:p>
         </w:tc>
@@ -1825,7 +1825,7 @@
                 <w:sz w:val="24"/>
                 <w:szCs w:val="24"/>
               </w:rPr>
-              <w:t xml:space="preserve">Klape sayısı kümes başına 30 adet, toplam 60 adet olmalıdır.</w:t>
+              <w:t xml:space="preserve">Klape sayısı kümes başına 40 adet, toplam 80 adet olmalıdır. Mekanik projede hesaplanan asgari ihtiyaç kümes başına 30 klapedir (30 x 1.750 = 52.500 m³/h &gt; 46.717 m³/h); kurulacak sistem bu asgarinin üzerindedir.</w:t>
             </w:r>
           </w:p>
           <w:p>
@@ -2019,7 +2019,7 @@
                 <w:spacing w:val="-8"/>
                 <w:sz w:val="24"/>
               </w:rPr>
-              <w:t xml:space="preserve">160</w:t>
+              <w:t xml:space="preserve">80</w:t>
             </w:r>
           </w:p>
         </w:tc>

</xml_diff>

<commit_message>
Yayin: kapasite 36.000, sihhi tesisat proformada, is plani Word nushasi
Co-Authored-By: Claude Opus 5 <noreply@anthropic.com>
Claude-Session: https://claude.ai/code/session_01HJPp6bx7wepUX5p8fxGcjg
</commit_message>
<xml_diff>
--- a/belgeler/07_EKIPMAN_TEKNIK_SARTNAMESI.docx
+++ b/belgeler/07_EKIPMAN_TEKNIK_SARTNAMESI.docx
@@ -1825,7 +1825,7 @@
                 <w:sz w:val="24"/>
                 <w:szCs w:val="24"/>
               </w:rPr>
-              <w:t xml:space="preserve">Klape sayısı kümes başına 40 adet, toplam 80 adet olmalıdır. Mekanik projede hesaplanan asgari ihtiyaç kümes başına 30 klapedir (30 x 1.750 = 52.500 m³/h &gt; 46.717 m³/h); kurulacak sistem bu asgarinin üzerindedir.</w:t>
+              <w:t xml:space="preserve">Klape sayısı kümes başına 30 adet, toplam 60 adet olmalıdır (mekanik proje: 30 x 1.750 = 52.500 m³/h &gt; gerekli 46.717 m³/h).</w:t>
             </w:r>
           </w:p>
           <w:p>
@@ -2019,7 +2019,7 @@
                 <w:spacing w:val="-8"/>
                 <w:sz w:val="24"/>
               </w:rPr>
-              <w:t xml:space="preserve">80</w:t>
+              <w:t xml:space="preserve">60</w:t>
             </w:r>
           </w:p>
         </w:tc>

</xml_diff>

<commit_message>
Yayın: makine-ekipman gideri tek proformaya bağlandı, ısıtma lotu iptal
Co-Authored-By: Claude Opus 5 <noreply@anthropic.com>
Claude-Session: https://claude.ai/code/session_01HJPp6bx7wepUX5p8fxGcjg
</commit_message>
<xml_diff>
--- a/belgeler/07_EKIPMAN_TEKNIK_SARTNAMESI.docx
+++ b/belgeler/07_EKIPMAN_TEKNIK_SARTNAMESI.docx
@@ -3088,6 +3088,565 @@
                 <w:szCs w:val="24"/>
               </w:rPr>
               <w:t xml:space="preserve">Elektrik panosu kapasitesi; kümesteki fan, klape, yemleme, sulama ve soğutma pedi sistemini çalıştırmaya yeterli olmalıdır.</w:t>
+            </w:r>
+          </w:p>
+        </w:tc>
+        <w:tc>
+          <w:tcPr>
+            <w:tcW w:w="460" w:type="pct"/>
+          </w:tcPr>
+          <w:p>
+            <w:pPr>
+              <w:spacing w:line="160" w:lineRule="atLeast"/>
+              <w:jc w:val="center"/>
+              <w:cnfStyle w:val="000000000000" w:firstRow="0" w:lastRow="0" w:firstColumn="0" w:lastColumn="0" w:oddVBand="0" w:evenVBand="0" w:oddHBand="0" w:evenHBand="0" w:firstRowFirstColumn="0" w:firstRowLastColumn="0" w:lastRowFirstColumn="0" w:lastRowLastColumn="0"/>
+              <w:rPr>
+                <w:color w:val="000000" w:themeColor="text1"/>
+                <w:sz w:val="24"/>
+                <w:szCs w:val="24"/>
+                <w:highlight w:val="yellow"/>
+              </w:rPr>
+            </w:pPr>
+            <w:r>
+              <w:rPr>
+                <w:color w:val="000000" w:themeColor="text1"/>
+                <w:spacing w:val="-4"/>
+                <w:sz w:val="24"/>
+              </w:rPr>
+              <w:t xml:space="preserve">ADET</w:t>
+            </w:r>
+          </w:p>
+        </w:tc>
+        <w:tc>
+          <w:tcPr>
+            <w:tcW w:w="664" w:type="pct"/>
+          </w:tcPr>
+          <w:p>
+            <w:pPr>
+              <w:spacing w:line="160" w:lineRule="atLeast"/>
+              <w:ind w:left="360"/>
+              <w:jc w:val="center"/>
+              <w:cnfStyle w:val="000000000000" w:firstRow="0" w:lastRow="0" w:firstColumn="0" w:lastColumn="0" w:oddVBand="0" w:evenVBand="0" w:oddHBand="0" w:evenHBand="0" w:firstRowFirstColumn="0" w:firstRowLastColumn="0" w:lastRowFirstColumn="0" w:lastRowLastColumn="0"/>
+              <w:rPr>
+                <w:color w:val="000000" w:themeColor="text1"/>
+                <w:sz w:val="24"/>
+                <w:szCs w:val="24"/>
+                <w:highlight w:val="yellow"/>
+              </w:rPr>
+            </w:pPr>
+            <w:r>
+              <w:rPr>
+                <w:color w:val="000000" w:themeColor="text1"/>
+                <w:spacing w:val="-8"/>
+                <w:sz w:val="24"/>
+              </w:rPr>
+              <w:t xml:space="preserve">2</w:t>
+            </w:r>
+          </w:p>
+        </w:tc>
+      </w:tr>
+      <w:tr>
+        <w:trPr>
+          <w:cnfStyle w:val="000000100000" w:firstRow="0" w:lastRow="0" w:firstColumn="0" w:lastColumn="0" w:oddVBand="0" w:evenVBand="0" w:oddHBand="1" w:evenHBand="0" w:firstRowFirstColumn="0" w:firstRowLastColumn="0" w:lastRowFirstColumn="0" w:lastRowLastColumn="0"/>
+          <w:trHeight w:val="1254"/>
+        </w:trPr>
+        <w:tc>
+          <w:tcPr>
+            <w:cnfStyle w:val="001000000000" w:firstRow="0" w:lastRow="0" w:firstColumn="1" w:lastColumn="0" w:oddVBand="0" w:evenVBand="0" w:oddHBand="0" w:evenHBand="0" w:firstRowFirstColumn="0" w:firstRowLastColumn="0" w:lastRowFirstColumn="0" w:lastRowLastColumn="0"/>
+            <w:tcW w:w="226" w:type="pct"/>
+          </w:tcPr>
+          <w:p>
+            <w:pPr>
+              <w:rPr>
+                <w:b/>
+                <w:bCs/>
+                <w:i w:val="0"/>
+                <w:iCs w:val="0"/>
+                <w:color w:val="000000" w:themeColor="text1"/>
+                <w:sz w:val="24"/>
+                <w:szCs w:val="24"/>
+              </w:rPr>
+            </w:pPr>
+            <w:r>
+              <w:rPr>
+                <w:b/>
+                <w:bCs/>
+                <w:i w:val="0"/>
+                <w:iCs w:val="0"/>
+                <w:color w:val="000000" w:themeColor="text1"/>
+                <w:sz w:val="24"/>
+                <w:szCs w:val="24"/>
+              </w:rPr>
+              <w:t xml:space="preserve">9</w:t>
+            </w:r>
+          </w:p>
+        </w:tc>
+        <w:tc>
+          <w:tcPr>
+            <w:tcW w:w="1091" w:type="pct"/>
+          </w:tcPr>
+          <w:p>
+            <w:pPr>
+              <w:pStyle w:val="Tabloerii"/>
+              <w:snapToGrid w:val="0"/>
+              <w:jc w:val="right"/>
+              <w:cnfStyle w:val="000000100000" w:firstRow="0" w:lastRow="0" w:firstColumn="0" w:lastColumn="0" w:oddVBand="0" w:evenVBand="0" w:oddHBand="1" w:evenHBand="0" w:firstRowFirstColumn="0" w:firstRowLastColumn="0" w:lastRowFirstColumn="0" w:lastRowLastColumn="0"/>
+              <w:rPr>
+                <w:b/>
+                <w:color w:val="000000" w:themeColor="text1"/>
+              </w:rPr>
+            </w:pPr>
+            <w:r>
+              <w:rPr>
+                <w:b/>
+                <w:color w:val="000000" w:themeColor="text1"/>
+              </w:rPr>
+              <w:t xml:space="preserve">Aydınlatma Sistemi</w:t>
+            </w:r>
+          </w:p>
+        </w:tc>
+        <w:tc>
+          <w:tcPr>
+            <w:tcW w:w="2559" w:type="pct"/>
+          </w:tcPr>
+          <w:p>
+            <w:pPr>
+              <w:tabs>
+                <w:tab w:val="left" w:pos="5910"/>
+              </w:tabs>
+              <w:spacing w:line="200" w:lineRule="atLeast"/>
+              <w:jc w:val="right"/>
+              <w:cnfStyle w:val="000000100000" w:firstRow="0" w:lastRow="0" w:firstColumn="0" w:lastColumn="0" w:oddVBand="0" w:evenVBand="0" w:oddHBand="1" w:evenHBand="0" w:firstRowFirstColumn="0" w:firstRowLastColumn="0" w:lastRowFirstColumn="0" w:lastRowLastColumn="0"/>
+              <w:rPr>
+                <w:color w:val="000000" w:themeColor="text1"/>
+                <w:sz w:val="24"/>
+                <w:szCs w:val="24"/>
+              </w:rPr>
+            </w:pPr>
+            <w:r>
+              <w:rPr>
+                <w:color w:val="000000" w:themeColor="text1"/>
+                <w:sz w:val="24"/>
+                <w:szCs w:val="24"/>
+              </w:rPr>
+              <w:t xml:space="preserve">Kümes başına en az 56 adet lamba bulunmalıdır.</w:t>
+            </w:r>
+          </w:p>
+          <w:p>
+            <w:pPr>
+              <w:tabs>
+                <w:tab w:val="left" w:pos="5910"/>
+              </w:tabs>
+              <w:spacing w:line="200" w:lineRule="atLeast"/>
+              <w:jc w:val="right"/>
+              <w:cnfStyle w:val="000000100000" w:firstRow="0" w:lastRow="0" w:firstColumn="0" w:lastColumn="0" w:oddVBand="0" w:evenVBand="0" w:oddHBand="1" w:evenHBand="0" w:firstRowFirstColumn="0" w:firstRowLastColumn="0" w:lastRowFirstColumn="0" w:lastRowLastColumn="0"/>
+              <w:rPr>
+                <w:color w:val="000000" w:themeColor="text1"/>
+                <w:sz w:val="24"/>
+                <w:szCs w:val="24"/>
+              </w:rPr>
+            </w:pPr>
+            <w:r>
+              <w:rPr>
+                <w:color w:val="000000" w:themeColor="text1"/>
+                <w:sz w:val="24"/>
+                <w:szCs w:val="24"/>
+              </w:rPr>
+              <w:t xml:space="preserve">Lamba tipi E27 duylu LED olmalı, gücü 7-12 W arasında seçilmelidir.</w:t>
+            </w:r>
+          </w:p>
+          <w:p>
+            <w:pPr>
+              <w:tabs>
+                <w:tab w:val="left" w:pos="5910"/>
+              </w:tabs>
+              <w:spacing w:line="200" w:lineRule="atLeast"/>
+              <w:jc w:val="right"/>
+              <w:cnfStyle w:val="000000100000" w:firstRow="0" w:lastRow="0" w:firstColumn="0" w:lastColumn="0" w:oddVBand="0" w:evenVBand="0" w:oddHBand="1" w:evenHBand="0" w:firstRowFirstColumn="0" w:firstRowLastColumn="0" w:lastRowFirstColumn="0" w:lastRowLastColumn="0"/>
+              <w:rPr>
+                <w:color w:val="000000" w:themeColor="text1"/>
+                <w:sz w:val="24"/>
+                <w:szCs w:val="24"/>
+              </w:rPr>
+            </w:pPr>
+            <w:r>
+              <w:rPr>
+                <w:color w:val="000000" w:themeColor="text1"/>
+                <w:sz w:val="24"/>
+                <w:szCs w:val="24"/>
+              </w:rPr>
+              <w:t xml:space="preserve">Duylar contalı ve kümes ortamına dayanıklı olmalıdır.</w:t>
+            </w:r>
+          </w:p>
+          <w:p>
+            <w:pPr>
+              <w:tabs>
+                <w:tab w:val="left" w:pos="5910"/>
+              </w:tabs>
+              <w:spacing w:line="200" w:lineRule="atLeast"/>
+              <w:jc w:val="right"/>
+              <w:cnfStyle w:val="000000100000" w:firstRow="0" w:lastRow="0" w:firstColumn="0" w:lastColumn="0" w:oddVBand="0" w:evenVBand="0" w:oddHBand="1" w:evenHBand="0" w:firstRowFirstColumn="0" w:firstRowLastColumn="0" w:lastRowFirstColumn="0" w:lastRowLastColumn="0"/>
+              <w:rPr>
+                <w:color w:val="000000" w:themeColor="text1"/>
+                <w:sz w:val="24"/>
+                <w:szCs w:val="24"/>
+              </w:rPr>
+            </w:pPr>
+            <w:r>
+              <w:rPr>
+                <w:color w:val="000000" w:themeColor="text1"/>
+                <w:sz w:val="24"/>
+                <w:szCs w:val="24"/>
+              </w:rPr>
+              <w:t xml:space="preserve">Ampul rengi beyaz ve gün ışığı olarak sağlanmalıdır.</w:t>
+            </w:r>
+          </w:p>
+          <w:p>
+            <w:pPr>
+              <w:tabs>
+                <w:tab w:val="left" w:pos="5910"/>
+              </w:tabs>
+              <w:spacing w:line="200" w:lineRule="atLeast"/>
+              <w:jc w:val="right"/>
+              <w:cnfStyle w:val="000000100000" w:firstRow="0" w:lastRow="0" w:firstColumn="0" w:lastColumn="0" w:oddVBand="0" w:evenVBand="0" w:oddHBand="1" w:evenHBand="0" w:firstRowFirstColumn="0" w:firstRowLastColumn="0" w:lastRowFirstColumn="0" w:lastRowLastColumn="0"/>
+              <w:rPr>
+                <w:color w:val="000000" w:themeColor="text1"/>
+                <w:sz w:val="24"/>
+                <w:szCs w:val="24"/>
+              </w:rPr>
+            </w:pPr>
+            <w:r>
+              <w:rPr>
+                <w:color w:val="000000" w:themeColor="text1"/>
+                <w:sz w:val="24"/>
+                <w:szCs w:val="24"/>
+              </w:rPr>
+              <w:t xml:space="preserve">Aydınlatma hattı kablo uzunluğu kümes başına en az 266 m olmalıdır.</w:t>
+            </w:r>
+          </w:p>
+          <w:p>
+            <w:pPr>
+              <w:tabs>
+                <w:tab w:val="left" w:pos="5910"/>
+              </w:tabs>
+              <w:spacing w:line="200" w:lineRule="atLeast"/>
+              <w:jc w:val="right"/>
+              <w:cnfStyle w:val="000000100000" w:firstRow="0" w:lastRow="0" w:firstColumn="0" w:lastColumn="0" w:oddVBand="0" w:evenVBand="0" w:oddHBand="1" w:evenHBand="0" w:firstRowFirstColumn="0" w:firstRowLastColumn="0" w:lastRowFirstColumn="0" w:lastRowLastColumn="0"/>
+              <w:rPr>
+                <w:color w:val="000000" w:themeColor="text1"/>
+                <w:sz w:val="24"/>
+                <w:szCs w:val="24"/>
+              </w:rPr>
+            </w:pPr>
+            <w:r>
+              <w:rPr>
+                <w:color w:val="000000" w:themeColor="text1"/>
+                <w:sz w:val="24"/>
+                <w:szCs w:val="24"/>
+              </w:rPr>
+              <w:t xml:space="preserve">Aydınlatma, kümes kontrol panosundan kumanda edilebilmelidir.</w:t>
+            </w:r>
+          </w:p>
+        </w:tc>
+        <w:tc>
+          <w:tcPr>
+            <w:tcW w:w="460" w:type="pct"/>
+          </w:tcPr>
+          <w:p>
+            <w:pPr>
+              <w:spacing w:line="160" w:lineRule="atLeast"/>
+              <w:jc w:val="center"/>
+              <w:cnfStyle w:val="000000100000" w:firstRow="0" w:lastRow="0" w:firstColumn="0" w:lastColumn="0" w:oddVBand="0" w:evenVBand="0" w:oddHBand="1" w:evenHBand="0" w:firstRowFirstColumn="0" w:firstRowLastColumn="0" w:lastRowFirstColumn="0" w:lastRowLastColumn="0"/>
+              <w:rPr>
+                <w:color w:val="000000" w:themeColor="text1"/>
+                <w:sz w:val="24"/>
+                <w:szCs w:val="24"/>
+                <w:highlight w:val="yellow"/>
+              </w:rPr>
+            </w:pPr>
+            <w:r>
+              <w:rPr>
+                <w:color w:val="000000" w:themeColor="text1"/>
+                <w:spacing w:val="-4"/>
+                <w:sz w:val="24"/>
+              </w:rPr>
+              <w:t xml:space="preserve">ADET</w:t>
+            </w:r>
+          </w:p>
+        </w:tc>
+        <w:tc>
+          <w:tcPr>
+            <w:tcW w:w="664" w:type="pct"/>
+          </w:tcPr>
+          <w:p>
+            <w:pPr>
+              <w:spacing w:line="160" w:lineRule="atLeast"/>
+              <w:ind w:left="360"/>
+              <w:jc w:val="center"/>
+              <w:cnfStyle w:val="000000100000" w:firstRow="0" w:lastRow="0" w:firstColumn="0" w:lastColumn="0" w:oddVBand="0" w:evenVBand="0" w:oddHBand="1" w:evenHBand="0" w:firstRowFirstColumn="0" w:firstRowLastColumn="0" w:lastRowFirstColumn="0" w:lastRowLastColumn="0"/>
+              <w:rPr>
+                <w:color w:val="000000" w:themeColor="text1"/>
+                <w:sz w:val="24"/>
+                <w:szCs w:val="24"/>
+                <w:highlight w:val="yellow"/>
+              </w:rPr>
+            </w:pPr>
+            <w:r>
+              <w:rPr>
+                <w:color w:val="000000" w:themeColor="text1"/>
+                <w:spacing w:val="-8"/>
+                <w:sz w:val="24"/>
+              </w:rPr>
+              <w:t xml:space="preserve">2</w:t>
+            </w:r>
+          </w:p>
+        </w:tc>
+      </w:tr>
+      <w:tr>
+        <w:trPr>
+          <w:trHeight w:val="1254"/>
+        </w:trPr>
+        <w:tc>
+          <w:tcPr>
+            <w:cnfStyle w:val="001000000000" w:firstRow="0" w:lastRow="0" w:firstColumn="1" w:lastColumn="0" w:oddVBand="0" w:evenVBand="0" w:oddHBand="0" w:evenHBand="0" w:firstRowFirstColumn="0" w:firstRowLastColumn="0" w:lastRowFirstColumn="0" w:lastRowLastColumn="0"/>
+            <w:tcW w:w="226" w:type="pct"/>
+          </w:tcPr>
+          <w:p>
+            <w:pPr>
+              <w:rPr>
+                <w:b/>
+                <w:bCs/>
+                <w:i w:val="0"/>
+                <w:iCs w:val="0"/>
+                <w:color w:val="000000" w:themeColor="text1"/>
+                <w:sz w:val="24"/>
+                <w:szCs w:val="24"/>
+              </w:rPr>
+            </w:pPr>
+            <w:r>
+              <w:rPr>
+                <w:b/>
+                <w:bCs/>
+                <w:i w:val="0"/>
+                <w:iCs w:val="0"/>
+                <w:color w:val="000000" w:themeColor="text1"/>
+                <w:sz w:val="24"/>
+                <w:szCs w:val="24"/>
+              </w:rPr>
+              <w:t xml:space="preserve">10</w:t>
+            </w:r>
+          </w:p>
+        </w:tc>
+        <w:tc>
+          <w:tcPr>
+            <w:tcW w:w="1091" w:type="pct"/>
+          </w:tcPr>
+          <w:p>
+            <w:pPr>
+              <w:pStyle w:val="Tabloerii"/>
+              <w:snapToGrid w:val="0"/>
+              <w:jc w:val="right"/>
+              <w:cnfStyle w:val="000000000000" w:firstRow="0" w:lastRow="0" w:firstColumn="0" w:lastColumn="0" w:oddVBand="0" w:evenVBand="0" w:oddHBand="0" w:evenHBand="0" w:firstRowFirstColumn="0" w:firstRowLastColumn="0" w:lastRowFirstColumn="0" w:lastRowLastColumn="0"/>
+              <w:rPr>
+                <w:b/>
+                <w:color w:val="000000" w:themeColor="text1"/>
+              </w:rPr>
+            </w:pPr>
+            <w:r>
+              <w:rPr>
+                <w:b/>
+                <w:color w:val="000000" w:themeColor="text1"/>
+              </w:rPr>
+              <w:t xml:space="preserve">Isıtma Sistemi</w:t>
+            </w:r>
+          </w:p>
+        </w:tc>
+        <w:tc>
+          <w:tcPr>
+            <w:tcW w:w="2559" w:type="pct"/>
+          </w:tcPr>
+          <w:p>
+            <w:pPr>
+              <w:tabs>
+                <w:tab w:val="left" w:pos="5910"/>
+              </w:tabs>
+              <w:spacing w:line="200" w:lineRule="atLeast"/>
+              <w:jc w:val="right"/>
+              <w:cnfStyle w:val="000000000000" w:firstRow="0" w:lastRow="0" w:firstColumn="0" w:lastColumn="0" w:oddVBand="0" w:evenVBand="0" w:oddHBand="0" w:evenHBand="0" w:firstRowFirstColumn="0" w:firstRowLastColumn="0" w:lastRowFirstColumn="0" w:lastRowLastColumn="0"/>
+              <w:rPr>
+                <w:color w:val="000000" w:themeColor="text1"/>
+                <w:sz w:val="24"/>
+                <w:szCs w:val="24"/>
+              </w:rPr>
+            </w:pPr>
+            <w:r>
+              <w:rPr>
+                <w:color w:val="000000" w:themeColor="text1"/>
+                <w:sz w:val="24"/>
+                <w:szCs w:val="24"/>
+              </w:rPr>
+              <w:t xml:space="preserve">Isıtma sistemi kümes başına 1 adet, toplam 2 adet olmalıdır.</w:t>
+            </w:r>
+          </w:p>
+          <w:p>
+            <w:pPr>
+              <w:tabs>
+                <w:tab w:val="left" w:pos="5910"/>
+              </w:tabs>
+              <w:spacing w:line="200" w:lineRule="atLeast"/>
+              <w:jc w:val="right"/>
+              <w:cnfStyle w:val="000000000000" w:firstRow="0" w:lastRow="0" w:firstColumn="0" w:lastColumn="0" w:oddVBand="0" w:evenVBand="0" w:oddHBand="0" w:evenHBand="0" w:firstRowFirstColumn="0" w:firstRowLastColumn="0" w:lastRowFirstColumn="0" w:lastRowLastColumn="0"/>
+              <w:rPr>
+                <w:color w:val="000000" w:themeColor="text1"/>
+                <w:sz w:val="24"/>
+                <w:szCs w:val="24"/>
+              </w:rPr>
+            </w:pPr>
+            <w:r>
+              <w:rPr>
+                <w:color w:val="000000" w:themeColor="text1"/>
+                <w:sz w:val="24"/>
+                <w:szCs w:val="24"/>
+              </w:rPr>
+              <w:t xml:space="preserve">Isıl kapasite kümesin ısı yükünden hesaplanmıştır; cihaz kümes başına en az 264.000 kcal/h (307 kW) kapasitede olmalıdır. Ayrıntılı hesap 32 numaralı ısıtma teknik şartnamesindedir.</w:t>
+            </w:r>
+          </w:p>
+          <w:p>
+            <w:pPr>
+              <w:tabs>
+                <w:tab w:val="left" w:pos="5910"/>
+              </w:tabs>
+              <w:spacing w:line="200" w:lineRule="atLeast"/>
+              <w:jc w:val="right"/>
+              <w:cnfStyle w:val="000000000000" w:firstRow="0" w:lastRow="0" w:firstColumn="0" w:lastColumn="0" w:oddVBand="0" w:evenVBand="0" w:oddHBand="0" w:evenHBand="0" w:firstRowFirstColumn="0" w:firstRowLastColumn="0" w:lastRowFirstColumn="0" w:lastRowLastColumn="0"/>
+              <w:rPr>
+                <w:color w:val="000000" w:themeColor="text1"/>
+                <w:sz w:val="24"/>
+                <w:szCs w:val="24"/>
+              </w:rPr>
+            </w:pPr>
+            <w:r>
+              <w:rPr>
+                <w:color w:val="000000" w:themeColor="text1"/>
+                <w:sz w:val="24"/>
+                <w:szCs w:val="24"/>
+              </w:rPr>
+              <w:t xml:space="preserve">Isıtılacak alan kümes başına en az 1.060 m² olmalıdır.</w:t>
+            </w:r>
+          </w:p>
+          <w:p>
+            <w:pPr>
+              <w:tabs>
+                <w:tab w:val="left" w:pos="5910"/>
+              </w:tabs>
+              <w:spacing w:line="200" w:lineRule="atLeast"/>
+              <w:jc w:val="right"/>
+              <w:cnfStyle w:val="000000000000" w:firstRow="0" w:lastRow="0" w:firstColumn="0" w:lastColumn="0" w:oddVBand="0" w:evenVBand="0" w:oddHBand="0" w:evenHBand="0" w:firstRowFirstColumn="0" w:firstRowLastColumn="0" w:lastRowFirstColumn="0" w:lastRowLastColumn="0"/>
+              <w:rPr>
+                <w:color w:val="000000" w:themeColor="text1"/>
+                <w:sz w:val="24"/>
+                <w:szCs w:val="24"/>
+              </w:rPr>
+            </w:pPr>
+            <w:r>
+              <w:rPr>
+                <w:color w:val="000000" w:themeColor="text1"/>
+                <w:sz w:val="24"/>
+                <w:szCs w:val="24"/>
+              </w:rPr>
+              <w:t xml:space="preserve">Katı yakıtlı, sıcak hava üretecek biçimde çalışmalı; yanma haznesi ve kazan çelik olmalıdır.</w:t>
+            </w:r>
+          </w:p>
+          <w:p>
+            <w:pPr>
+              <w:tabs>
+                <w:tab w:val="left" w:pos="5910"/>
+              </w:tabs>
+              <w:spacing w:line="200" w:lineRule="atLeast"/>
+              <w:jc w:val="right"/>
+              <w:cnfStyle w:val="000000000000" w:firstRow="0" w:lastRow="0" w:firstColumn="0" w:lastColumn="0" w:oddVBand="0" w:evenVBand="0" w:oddHBand="0" w:evenHBand="0" w:firstRowFirstColumn="0" w:firstRowLastColumn="0" w:lastRowFirstColumn="0" w:lastRowLastColumn="0"/>
+              <w:rPr>
+                <w:color w:val="000000" w:themeColor="text1"/>
+                <w:sz w:val="24"/>
+                <w:szCs w:val="24"/>
+              </w:rPr>
+            </w:pPr>
+            <w:r>
+              <w:rPr>
+                <w:color w:val="000000" w:themeColor="text1"/>
+                <w:sz w:val="24"/>
+                <w:szCs w:val="24"/>
+              </w:rPr>
+              <w:t xml:space="preserve">Fan motoru en az 5,5 kW, basma debisi en az 21.000 m³/h olmalıdır.</w:t>
+            </w:r>
+          </w:p>
+          <w:p>
+            <w:pPr>
+              <w:tabs>
+                <w:tab w:val="left" w:pos="5910"/>
+              </w:tabs>
+              <w:spacing w:line="200" w:lineRule="atLeast"/>
+              <w:jc w:val="right"/>
+              <w:cnfStyle w:val="000000000000" w:firstRow="0" w:lastRow="0" w:firstColumn="0" w:lastColumn="0" w:oddVBand="0" w:evenVBand="0" w:oddHBand="0" w:evenHBand="0" w:firstRowFirstColumn="0" w:firstRowLastColumn="0" w:lastRowFirstColumn="0" w:lastRowLastColumn="0"/>
+              <w:rPr>
+                <w:color w:val="000000" w:themeColor="text1"/>
+                <w:sz w:val="24"/>
+                <w:szCs w:val="24"/>
+              </w:rPr>
+            </w:pPr>
+            <w:r>
+              <w:rPr>
+                <w:color w:val="000000" w:themeColor="text1"/>
+                <w:sz w:val="24"/>
+                <w:szCs w:val="24"/>
+              </w:rPr>
+              <w:t xml:space="preserve">Panoda kontaktör, termik ve faz koruma rölesi bulunmalıdır.</w:t>
+            </w:r>
+          </w:p>
+          <w:p>
+            <w:pPr>
+              <w:tabs>
+                <w:tab w:val="left" w:pos="5910"/>
+              </w:tabs>
+              <w:spacing w:line="200" w:lineRule="atLeast"/>
+              <w:jc w:val="right"/>
+              <w:cnfStyle w:val="000000000000" w:firstRow="0" w:lastRow="0" w:firstColumn="0" w:lastColumn="0" w:oddVBand="0" w:evenVBand="0" w:oddHBand="0" w:evenHBand="0" w:firstRowFirstColumn="0" w:firstRowLastColumn="0" w:lastRowFirstColumn="0" w:lastRowLastColumn="0"/>
+              <w:rPr>
+                <w:color w:val="000000" w:themeColor="text1"/>
+                <w:sz w:val="24"/>
+                <w:szCs w:val="24"/>
+              </w:rPr>
+            </w:pPr>
+            <w:r>
+              <w:rPr>
+                <w:color w:val="000000" w:themeColor="text1"/>
+                <w:sz w:val="24"/>
+                <w:szCs w:val="24"/>
+              </w:rPr>
+              <w:t xml:space="preserve">Sıcak hava dağıtımı için kümes içi branda ve hava kanalı ekipmanları fiyata dâhil olmalıdır.</w:t>
+            </w:r>
+          </w:p>
+          <w:p>
+            <w:pPr>
+              <w:tabs>
+                <w:tab w:val="left" w:pos="5910"/>
+              </w:tabs>
+              <w:spacing w:line="200" w:lineRule="atLeast"/>
+              <w:jc w:val="right"/>
+              <w:cnfStyle w:val="000000000000" w:firstRow="0" w:lastRow="0" w:firstColumn="0" w:lastColumn="0" w:oddVBand="0" w:evenVBand="0" w:oddHBand="0" w:evenHBand="0" w:firstRowFirstColumn="0" w:firstRowLastColumn="0" w:lastRowFirstColumn="0" w:lastRowLastColumn="0"/>
+              <w:rPr>
+                <w:color w:val="000000" w:themeColor="text1"/>
+                <w:sz w:val="24"/>
+                <w:szCs w:val="24"/>
+              </w:rPr>
+            </w:pPr>
+            <w:r>
+              <w:rPr>
+                <w:color w:val="000000" w:themeColor="text1"/>
+                <w:sz w:val="24"/>
+                <w:szCs w:val="24"/>
+              </w:rPr>
+              <w:t xml:space="preserve">Marka ve modele bağlı değildir; belirtilen değerleri sağlayan her ürün teklif edilebilir.</w:t>
             </w:r>
           </w:p>
         </w:tc>

</xml_diff>

<commit_message>
Yayın: makine-ekipman gideri 3.784.288,46 TL
Co-Authored-By: Claude Opus 5 <noreply@anthropic.com>
Claude-Session: https://claude.ai/code/session_01HJPp6bx7wepUX5p8fxGcjg
</commit_message>
<xml_diff>
--- a/belgeler/07_EKIPMAN_TEKNIK_SARTNAMESI.docx
+++ b/belgeler/07_EKIPMAN_TEKNIK_SARTNAMESI.docx
@@ -3201,7 +3201,7 @@
                 <w:b/>
                 <w:color w:val="000000" w:themeColor="text1"/>
               </w:rPr>
-              <w:t xml:space="preserve">Aydınlatma Sistemi</w:t>
+              <w:t xml:space="preserve">Isıtma Sistemi</w:t>
             </w:r>
           </w:p>
         </w:tc>
@@ -3229,122 +3229,168 @@
                 <w:sz w:val="24"/>
                 <w:szCs w:val="24"/>
               </w:rPr>
-              <w:t xml:space="preserve">Kümes başına en az 56 adet lamba bulunmalıdır.</w:t>
-            </w:r>
-          </w:p>
-          <w:p>
-            <w:pPr>
-              <w:tabs>
-                <w:tab w:val="left" w:pos="5910"/>
-              </w:tabs>
-              <w:spacing w:line="200" w:lineRule="atLeast"/>
-              <w:jc w:val="right"/>
-              <w:cnfStyle w:val="000000100000" w:firstRow="0" w:lastRow="0" w:firstColumn="0" w:lastColumn="0" w:oddVBand="0" w:evenVBand="0" w:oddHBand="1" w:evenHBand="0" w:firstRowFirstColumn="0" w:firstRowLastColumn="0" w:lastRowFirstColumn="0" w:lastRowLastColumn="0"/>
-              <w:rPr>
-                <w:color w:val="000000" w:themeColor="text1"/>
-                <w:sz w:val="24"/>
-                <w:szCs w:val="24"/>
-              </w:rPr>
-            </w:pPr>
-            <w:r>
-              <w:rPr>
-                <w:color w:val="000000" w:themeColor="text1"/>
-                <w:sz w:val="24"/>
-                <w:szCs w:val="24"/>
-              </w:rPr>
-              <w:t xml:space="preserve">Lamba tipi E27 duylu LED olmalı, gücü 7-12 W arasında seçilmelidir.</w:t>
-            </w:r>
-          </w:p>
-          <w:p>
-            <w:pPr>
-              <w:tabs>
-                <w:tab w:val="left" w:pos="5910"/>
-              </w:tabs>
-              <w:spacing w:line="200" w:lineRule="atLeast"/>
-              <w:jc w:val="right"/>
-              <w:cnfStyle w:val="000000100000" w:firstRow="0" w:lastRow="0" w:firstColumn="0" w:lastColumn="0" w:oddVBand="0" w:evenVBand="0" w:oddHBand="1" w:evenHBand="0" w:firstRowFirstColumn="0" w:firstRowLastColumn="0" w:lastRowFirstColumn="0" w:lastRowLastColumn="0"/>
-              <w:rPr>
-                <w:color w:val="000000" w:themeColor="text1"/>
-                <w:sz w:val="24"/>
-                <w:szCs w:val="24"/>
-              </w:rPr>
-            </w:pPr>
-            <w:r>
-              <w:rPr>
-                <w:color w:val="000000" w:themeColor="text1"/>
-                <w:sz w:val="24"/>
-                <w:szCs w:val="24"/>
-              </w:rPr>
-              <w:t xml:space="preserve">Duylar contalı ve kümes ortamına dayanıklı olmalıdır.</w:t>
-            </w:r>
-          </w:p>
-          <w:p>
-            <w:pPr>
-              <w:tabs>
-                <w:tab w:val="left" w:pos="5910"/>
-              </w:tabs>
-              <w:spacing w:line="200" w:lineRule="atLeast"/>
-              <w:jc w:val="right"/>
-              <w:cnfStyle w:val="000000100000" w:firstRow="0" w:lastRow="0" w:firstColumn="0" w:lastColumn="0" w:oddVBand="0" w:evenVBand="0" w:oddHBand="1" w:evenHBand="0" w:firstRowFirstColumn="0" w:firstRowLastColumn="0" w:lastRowFirstColumn="0" w:lastRowLastColumn="0"/>
-              <w:rPr>
-                <w:color w:val="000000" w:themeColor="text1"/>
-                <w:sz w:val="24"/>
-                <w:szCs w:val="24"/>
-              </w:rPr>
-            </w:pPr>
-            <w:r>
-              <w:rPr>
-                <w:color w:val="000000" w:themeColor="text1"/>
-                <w:sz w:val="24"/>
-                <w:szCs w:val="24"/>
-              </w:rPr>
-              <w:t xml:space="preserve">Ampul rengi beyaz ve gün ışığı olarak sağlanmalıdır.</w:t>
-            </w:r>
-          </w:p>
-          <w:p>
-            <w:pPr>
-              <w:tabs>
-                <w:tab w:val="left" w:pos="5910"/>
-              </w:tabs>
-              <w:spacing w:line="200" w:lineRule="atLeast"/>
-              <w:jc w:val="right"/>
-              <w:cnfStyle w:val="000000100000" w:firstRow="0" w:lastRow="0" w:firstColumn="0" w:lastColumn="0" w:oddVBand="0" w:evenVBand="0" w:oddHBand="1" w:evenHBand="0" w:firstRowFirstColumn="0" w:firstRowLastColumn="0" w:lastRowFirstColumn="0" w:lastRowLastColumn="0"/>
-              <w:rPr>
-                <w:color w:val="000000" w:themeColor="text1"/>
-                <w:sz w:val="24"/>
-                <w:szCs w:val="24"/>
-              </w:rPr>
-            </w:pPr>
-            <w:r>
-              <w:rPr>
-                <w:color w:val="000000" w:themeColor="text1"/>
-                <w:sz w:val="24"/>
-                <w:szCs w:val="24"/>
-              </w:rPr>
-              <w:t xml:space="preserve">Aydınlatma hattı kablo uzunluğu kümes başına en az 266 m olmalıdır.</w:t>
-            </w:r>
-          </w:p>
-          <w:p>
-            <w:pPr>
-              <w:tabs>
-                <w:tab w:val="left" w:pos="5910"/>
-              </w:tabs>
-              <w:spacing w:line="200" w:lineRule="atLeast"/>
-              <w:jc w:val="right"/>
-              <w:cnfStyle w:val="000000100000" w:firstRow="0" w:lastRow="0" w:firstColumn="0" w:lastColumn="0" w:oddVBand="0" w:evenVBand="0" w:oddHBand="1" w:evenHBand="0" w:firstRowFirstColumn="0" w:firstRowLastColumn="0" w:lastRowFirstColumn="0" w:lastRowLastColumn="0"/>
-              <w:rPr>
-                <w:color w:val="000000" w:themeColor="text1"/>
-                <w:sz w:val="24"/>
-                <w:szCs w:val="24"/>
-              </w:rPr>
-            </w:pPr>
-            <w:r>
-              <w:rPr>
-                <w:color w:val="000000" w:themeColor="text1"/>
-                <w:sz w:val="24"/>
-                <w:szCs w:val="24"/>
-              </w:rPr>
-              <w:t xml:space="preserve">Aydınlatma, kümes kontrol panosundan kumanda edilebilmelidir.</w:t>
+              <w:t xml:space="preserve">Isıtma sistemi kümes başına 1 adet, toplam 2 adet olmalıdır.</w:t>
+            </w:r>
+          </w:p>
+          <w:p>
+            <w:pPr>
+              <w:tabs>
+                <w:tab w:val="left" w:pos="5910"/>
+              </w:tabs>
+              <w:spacing w:line="200" w:lineRule="atLeast"/>
+              <w:jc w:val="right"/>
+              <w:cnfStyle w:val="000000100000" w:firstRow="0" w:lastRow="0" w:firstColumn="0" w:lastColumn="0" w:oddVBand="0" w:evenVBand="0" w:oddHBand="1" w:evenHBand="0" w:firstRowFirstColumn="0" w:firstRowLastColumn="0" w:lastRowFirstColumn="0" w:lastRowLastColumn="0"/>
+              <w:rPr>
+                <w:color w:val="000000" w:themeColor="text1"/>
+                <w:sz w:val="24"/>
+                <w:szCs w:val="24"/>
+              </w:rPr>
+            </w:pPr>
+            <w:r>
+              <w:rPr>
+                <w:color w:val="000000" w:themeColor="text1"/>
+                <w:sz w:val="24"/>
+                <w:szCs w:val="24"/>
+              </w:rPr>
+              <w:t xml:space="preserve">Isıl kapasite kümesin ısı yükünden hesaplanmıştır; cihaz kümes başına en az 264.000 kcal/h (307 kW) kapasitede olmalıdır. Ayrıntılı hesap 32 numaralı ısıtma teknik şartnamesindedir.</w:t>
+            </w:r>
+          </w:p>
+          <w:p>
+            <w:pPr>
+              <w:tabs>
+                <w:tab w:val="left" w:pos="5910"/>
+              </w:tabs>
+              <w:spacing w:line="200" w:lineRule="atLeast"/>
+              <w:jc w:val="right"/>
+              <w:cnfStyle w:val="000000100000" w:firstRow="0" w:lastRow="0" w:firstColumn="0" w:lastColumn="0" w:oddVBand="0" w:evenVBand="0" w:oddHBand="1" w:evenHBand="0" w:firstRowFirstColumn="0" w:firstRowLastColumn="0" w:lastRowFirstColumn="0" w:lastRowLastColumn="0"/>
+              <w:rPr>
+                <w:color w:val="000000" w:themeColor="text1"/>
+                <w:sz w:val="24"/>
+                <w:szCs w:val="24"/>
+              </w:rPr>
+            </w:pPr>
+            <w:r>
+              <w:rPr>
+                <w:color w:val="000000" w:themeColor="text1"/>
+                <w:sz w:val="24"/>
+                <w:szCs w:val="24"/>
+              </w:rPr>
+              <w:t xml:space="preserve">Isıtılacak alan kümes başına en az 1.060 m² olmalıdır.</w:t>
+            </w:r>
+          </w:p>
+          <w:p>
+            <w:pPr>
+              <w:tabs>
+                <w:tab w:val="left" w:pos="5910"/>
+              </w:tabs>
+              <w:spacing w:line="200" w:lineRule="atLeast"/>
+              <w:jc w:val="right"/>
+              <w:cnfStyle w:val="000000100000" w:firstRow="0" w:lastRow="0" w:firstColumn="0" w:lastColumn="0" w:oddVBand="0" w:evenVBand="0" w:oddHBand="1" w:evenHBand="0" w:firstRowFirstColumn="0" w:firstRowLastColumn="0" w:lastRowFirstColumn="0" w:lastRowLastColumn="0"/>
+              <w:rPr>
+                <w:color w:val="000000" w:themeColor="text1"/>
+                <w:sz w:val="24"/>
+                <w:szCs w:val="24"/>
+              </w:rPr>
+            </w:pPr>
+            <w:r>
+              <w:rPr>
+                <w:color w:val="000000" w:themeColor="text1"/>
+                <w:sz w:val="24"/>
+                <w:szCs w:val="24"/>
+              </w:rPr>
+              <w:t xml:space="preserve">Katı yakıtlı, sıcak hava üretecek biçimde çalışmalı; yanma haznesi ve kazan çelik olmalıdır.</w:t>
+            </w:r>
+          </w:p>
+          <w:p>
+            <w:pPr>
+              <w:tabs>
+                <w:tab w:val="left" w:pos="5910"/>
+              </w:tabs>
+              <w:spacing w:line="200" w:lineRule="atLeast"/>
+              <w:jc w:val="right"/>
+              <w:cnfStyle w:val="000000100000" w:firstRow="0" w:lastRow="0" w:firstColumn="0" w:lastColumn="0" w:oddVBand="0" w:evenVBand="0" w:oddHBand="1" w:evenHBand="0" w:firstRowFirstColumn="0" w:firstRowLastColumn="0" w:lastRowFirstColumn="0" w:lastRowLastColumn="0"/>
+              <w:rPr>
+                <w:color w:val="000000" w:themeColor="text1"/>
+                <w:sz w:val="24"/>
+                <w:szCs w:val="24"/>
+              </w:rPr>
+            </w:pPr>
+            <w:r>
+              <w:rPr>
+                <w:color w:val="000000" w:themeColor="text1"/>
+                <w:sz w:val="24"/>
+                <w:szCs w:val="24"/>
+              </w:rPr>
+              <w:t xml:space="preserve">Fan motoru en az 5,5 kW, basma debisi en az 21.000 m³/h olmalıdır.</w:t>
+            </w:r>
+          </w:p>
+          <w:p>
+            <w:pPr>
+              <w:tabs>
+                <w:tab w:val="left" w:pos="5910"/>
+              </w:tabs>
+              <w:spacing w:line="200" w:lineRule="atLeast"/>
+              <w:jc w:val="right"/>
+              <w:cnfStyle w:val="000000100000" w:firstRow="0" w:lastRow="0" w:firstColumn="0" w:lastColumn="0" w:oddVBand="0" w:evenVBand="0" w:oddHBand="1" w:evenHBand="0" w:firstRowFirstColumn="0" w:firstRowLastColumn="0" w:lastRowFirstColumn="0" w:lastRowLastColumn="0"/>
+              <w:rPr>
+                <w:color w:val="000000" w:themeColor="text1"/>
+                <w:sz w:val="24"/>
+                <w:szCs w:val="24"/>
+              </w:rPr>
+            </w:pPr>
+            <w:r>
+              <w:rPr>
+                <w:color w:val="000000" w:themeColor="text1"/>
+                <w:sz w:val="24"/>
+                <w:szCs w:val="24"/>
+              </w:rPr>
+              <w:t xml:space="preserve">Panoda kontaktör, termik ve faz koruma rölesi bulunmalıdır.</w:t>
+            </w:r>
+          </w:p>
+          <w:p>
+            <w:pPr>
+              <w:tabs>
+                <w:tab w:val="left" w:pos="5910"/>
+              </w:tabs>
+              <w:spacing w:line="200" w:lineRule="atLeast"/>
+              <w:jc w:val="right"/>
+              <w:cnfStyle w:val="000000100000" w:firstRow="0" w:lastRow="0" w:firstColumn="0" w:lastColumn="0" w:oddVBand="0" w:evenVBand="0" w:oddHBand="1" w:evenHBand="0" w:firstRowFirstColumn="0" w:firstRowLastColumn="0" w:lastRowFirstColumn="0" w:lastRowLastColumn="0"/>
+              <w:rPr>
+                <w:color w:val="000000" w:themeColor="text1"/>
+                <w:sz w:val="24"/>
+                <w:szCs w:val="24"/>
+              </w:rPr>
+            </w:pPr>
+            <w:r>
+              <w:rPr>
+                <w:color w:val="000000" w:themeColor="text1"/>
+                <w:sz w:val="24"/>
+                <w:szCs w:val="24"/>
+              </w:rPr>
+              <w:t xml:space="preserve">Sıcak hava dağıtımı için kümes içi branda ve hava kanalı ekipmanları fiyata dâhil olmalıdır.</w:t>
+            </w:r>
+          </w:p>
+          <w:p>
+            <w:pPr>
+              <w:tabs>
+                <w:tab w:val="left" w:pos="5910"/>
+              </w:tabs>
+              <w:spacing w:line="200" w:lineRule="atLeast"/>
+              <w:jc w:val="right"/>
+              <w:cnfStyle w:val="000000100000" w:firstRow="0" w:lastRow="0" w:firstColumn="0" w:lastColumn="0" w:oddVBand="0" w:evenVBand="0" w:oddHBand="1" w:evenHBand="0" w:firstRowFirstColumn="0" w:firstRowLastColumn="0" w:lastRowFirstColumn="0" w:lastRowLastColumn="0"/>
+              <w:rPr>
+                <w:color w:val="000000" w:themeColor="text1"/>
+                <w:sz w:val="24"/>
+                <w:szCs w:val="24"/>
+              </w:rPr>
+            </w:pPr>
+            <w:r>
+              <w:rPr>
+                <w:color w:val="000000" w:themeColor="text1"/>
+                <w:sz w:val="24"/>
+                <w:szCs w:val="24"/>
+              </w:rPr>
+              <w:t xml:space="preserve">Marka ve modele bağlı değildir; belirtilen değerleri sağlayan her ürün teklif edilebilir.</w:t>
             </w:r>
           </w:p>
         </w:tc>
@@ -3384,308 +3430,6 @@
               <w:ind w:left="360"/>
               <w:jc w:val="center"/>
               <w:cnfStyle w:val="000000100000" w:firstRow="0" w:lastRow="0" w:firstColumn="0" w:lastColumn="0" w:oddVBand="0" w:evenVBand="0" w:oddHBand="1" w:evenHBand="0" w:firstRowFirstColumn="0" w:firstRowLastColumn="0" w:lastRowFirstColumn="0" w:lastRowLastColumn="0"/>
-              <w:rPr>
-                <w:color w:val="000000" w:themeColor="text1"/>
-                <w:sz w:val="24"/>
-                <w:szCs w:val="24"/>
-                <w:highlight w:val="yellow"/>
-              </w:rPr>
-            </w:pPr>
-            <w:r>
-              <w:rPr>
-                <w:color w:val="000000" w:themeColor="text1"/>
-                <w:spacing w:val="-8"/>
-                <w:sz w:val="24"/>
-              </w:rPr>
-              <w:t xml:space="preserve">2</w:t>
-            </w:r>
-          </w:p>
-        </w:tc>
-      </w:tr>
-      <w:tr>
-        <w:trPr>
-          <w:trHeight w:val="1254"/>
-        </w:trPr>
-        <w:tc>
-          <w:tcPr>
-            <w:cnfStyle w:val="001000000000" w:firstRow="0" w:lastRow="0" w:firstColumn="1" w:lastColumn="0" w:oddVBand="0" w:evenVBand="0" w:oddHBand="0" w:evenHBand="0" w:firstRowFirstColumn="0" w:firstRowLastColumn="0" w:lastRowFirstColumn="0" w:lastRowLastColumn="0"/>
-            <w:tcW w:w="226" w:type="pct"/>
-          </w:tcPr>
-          <w:p>
-            <w:pPr>
-              <w:rPr>
-                <w:b/>
-                <w:bCs/>
-                <w:i w:val="0"/>
-                <w:iCs w:val="0"/>
-                <w:color w:val="000000" w:themeColor="text1"/>
-                <w:sz w:val="24"/>
-                <w:szCs w:val="24"/>
-              </w:rPr>
-            </w:pPr>
-            <w:r>
-              <w:rPr>
-                <w:b/>
-                <w:bCs/>
-                <w:i w:val="0"/>
-                <w:iCs w:val="0"/>
-                <w:color w:val="000000" w:themeColor="text1"/>
-                <w:sz w:val="24"/>
-                <w:szCs w:val="24"/>
-              </w:rPr>
-              <w:t xml:space="preserve">10</w:t>
-            </w:r>
-          </w:p>
-        </w:tc>
-        <w:tc>
-          <w:tcPr>
-            <w:tcW w:w="1091" w:type="pct"/>
-          </w:tcPr>
-          <w:p>
-            <w:pPr>
-              <w:pStyle w:val="Tabloerii"/>
-              <w:snapToGrid w:val="0"/>
-              <w:jc w:val="right"/>
-              <w:cnfStyle w:val="000000000000" w:firstRow="0" w:lastRow="0" w:firstColumn="0" w:lastColumn="0" w:oddVBand="0" w:evenVBand="0" w:oddHBand="0" w:evenHBand="0" w:firstRowFirstColumn="0" w:firstRowLastColumn="0" w:lastRowFirstColumn="0" w:lastRowLastColumn="0"/>
-              <w:rPr>
-                <w:b/>
-                <w:color w:val="000000" w:themeColor="text1"/>
-              </w:rPr>
-            </w:pPr>
-            <w:r>
-              <w:rPr>
-                <w:b/>
-                <w:color w:val="000000" w:themeColor="text1"/>
-              </w:rPr>
-              <w:t xml:space="preserve">Isıtma Sistemi</w:t>
-            </w:r>
-          </w:p>
-        </w:tc>
-        <w:tc>
-          <w:tcPr>
-            <w:tcW w:w="2559" w:type="pct"/>
-          </w:tcPr>
-          <w:p>
-            <w:pPr>
-              <w:tabs>
-                <w:tab w:val="left" w:pos="5910"/>
-              </w:tabs>
-              <w:spacing w:line="200" w:lineRule="atLeast"/>
-              <w:jc w:val="right"/>
-              <w:cnfStyle w:val="000000000000" w:firstRow="0" w:lastRow="0" w:firstColumn="0" w:lastColumn="0" w:oddVBand="0" w:evenVBand="0" w:oddHBand="0" w:evenHBand="0" w:firstRowFirstColumn="0" w:firstRowLastColumn="0" w:lastRowFirstColumn="0" w:lastRowLastColumn="0"/>
-              <w:rPr>
-                <w:color w:val="000000" w:themeColor="text1"/>
-                <w:sz w:val="24"/>
-                <w:szCs w:val="24"/>
-              </w:rPr>
-            </w:pPr>
-            <w:r>
-              <w:rPr>
-                <w:color w:val="000000" w:themeColor="text1"/>
-                <w:sz w:val="24"/>
-                <w:szCs w:val="24"/>
-              </w:rPr>
-              <w:t xml:space="preserve">Isıtma sistemi kümes başına 1 adet, toplam 2 adet olmalıdır.</w:t>
-            </w:r>
-          </w:p>
-          <w:p>
-            <w:pPr>
-              <w:tabs>
-                <w:tab w:val="left" w:pos="5910"/>
-              </w:tabs>
-              <w:spacing w:line="200" w:lineRule="atLeast"/>
-              <w:jc w:val="right"/>
-              <w:cnfStyle w:val="000000000000" w:firstRow="0" w:lastRow="0" w:firstColumn="0" w:lastColumn="0" w:oddVBand="0" w:evenVBand="0" w:oddHBand="0" w:evenHBand="0" w:firstRowFirstColumn="0" w:firstRowLastColumn="0" w:lastRowFirstColumn="0" w:lastRowLastColumn="0"/>
-              <w:rPr>
-                <w:color w:val="000000" w:themeColor="text1"/>
-                <w:sz w:val="24"/>
-                <w:szCs w:val="24"/>
-              </w:rPr>
-            </w:pPr>
-            <w:r>
-              <w:rPr>
-                <w:color w:val="000000" w:themeColor="text1"/>
-                <w:sz w:val="24"/>
-                <w:szCs w:val="24"/>
-              </w:rPr>
-              <w:t xml:space="preserve">Isıl kapasite kümesin ısı yükünden hesaplanmıştır; cihaz kümes başına en az 264.000 kcal/h (307 kW) kapasitede olmalıdır. Ayrıntılı hesap 32 numaralı ısıtma teknik şartnamesindedir.</w:t>
-            </w:r>
-          </w:p>
-          <w:p>
-            <w:pPr>
-              <w:tabs>
-                <w:tab w:val="left" w:pos="5910"/>
-              </w:tabs>
-              <w:spacing w:line="200" w:lineRule="atLeast"/>
-              <w:jc w:val="right"/>
-              <w:cnfStyle w:val="000000000000" w:firstRow="0" w:lastRow="0" w:firstColumn="0" w:lastColumn="0" w:oddVBand="0" w:evenVBand="0" w:oddHBand="0" w:evenHBand="0" w:firstRowFirstColumn="0" w:firstRowLastColumn="0" w:lastRowFirstColumn="0" w:lastRowLastColumn="0"/>
-              <w:rPr>
-                <w:color w:val="000000" w:themeColor="text1"/>
-                <w:sz w:val="24"/>
-                <w:szCs w:val="24"/>
-              </w:rPr>
-            </w:pPr>
-            <w:r>
-              <w:rPr>
-                <w:color w:val="000000" w:themeColor="text1"/>
-                <w:sz w:val="24"/>
-                <w:szCs w:val="24"/>
-              </w:rPr>
-              <w:t xml:space="preserve">Isıtılacak alan kümes başına en az 1.060 m² olmalıdır.</w:t>
-            </w:r>
-          </w:p>
-          <w:p>
-            <w:pPr>
-              <w:tabs>
-                <w:tab w:val="left" w:pos="5910"/>
-              </w:tabs>
-              <w:spacing w:line="200" w:lineRule="atLeast"/>
-              <w:jc w:val="right"/>
-              <w:cnfStyle w:val="000000000000" w:firstRow="0" w:lastRow="0" w:firstColumn="0" w:lastColumn="0" w:oddVBand="0" w:evenVBand="0" w:oddHBand="0" w:evenHBand="0" w:firstRowFirstColumn="0" w:firstRowLastColumn="0" w:lastRowFirstColumn="0" w:lastRowLastColumn="0"/>
-              <w:rPr>
-                <w:color w:val="000000" w:themeColor="text1"/>
-                <w:sz w:val="24"/>
-                <w:szCs w:val="24"/>
-              </w:rPr>
-            </w:pPr>
-            <w:r>
-              <w:rPr>
-                <w:color w:val="000000" w:themeColor="text1"/>
-                <w:sz w:val="24"/>
-                <w:szCs w:val="24"/>
-              </w:rPr>
-              <w:t xml:space="preserve">Katı yakıtlı, sıcak hava üretecek biçimde çalışmalı; yanma haznesi ve kazan çelik olmalıdır.</w:t>
-            </w:r>
-          </w:p>
-          <w:p>
-            <w:pPr>
-              <w:tabs>
-                <w:tab w:val="left" w:pos="5910"/>
-              </w:tabs>
-              <w:spacing w:line="200" w:lineRule="atLeast"/>
-              <w:jc w:val="right"/>
-              <w:cnfStyle w:val="000000000000" w:firstRow="0" w:lastRow="0" w:firstColumn="0" w:lastColumn="0" w:oddVBand="0" w:evenVBand="0" w:oddHBand="0" w:evenHBand="0" w:firstRowFirstColumn="0" w:firstRowLastColumn="0" w:lastRowFirstColumn="0" w:lastRowLastColumn="0"/>
-              <w:rPr>
-                <w:color w:val="000000" w:themeColor="text1"/>
-                <w:sz w:val="24"/>
-                <w:szCs w:val="24"/>
-              </w:rPr>
-            </w:pPr>
-            <w:r>
-              <w:rPr>
-                <w:color w:val="000000" w:themeColor="text1"/>
-                <w:sz w:val="24"/>
-                <w:szCs w:val="24"/>
-              </w:rPr>
-              <w:t xml:space="preserve">Fan motoru en az 5,5 kW, basma debisi en az 21.000 m³/h olmalıdır.</w:t>
-            </w:r>
-          </w:p>
-          <w:p>
-            <w:pPr>
-              <w:tabs>
-                <w:tab w:val="left" w:pos="5910"/>
-              </w:tabs>
-              <w:spacing w:line="200" w:lineRule="atLeast"/>
-              <w:jc w:val="right"/>
-              <w:cnfStyle w:val="000000000000" w:firstRow="0" w:lastRow="0" w:firstColumn="0" w:lastColumn="0" w:oddVBand="0" w:evenVBand="0" w:oddHBand="0" w:evenHBand="0" w:firstRowFirstColumn="0" w:firstRowLastColumn="0" w:lastRowFirstColumn="0" w:lastRowLastColumn="0"/>
-              <w:rPr>
-                <w:color w:val="000000" w:themeColor="text1"/>
-                <w:sz w:val="24"/>
-                <w:szCs w:val="24"/>
-              </w:rPr>
-            </w:pPr>
-            <w:r>
-              <w:rPr>
-                <w:color w:val="000000" w:themeColor="text1"/>
-                <w:sz w:val="24"/>
-                <w:szCs w:val="24"/>
-              </w:rPr>
-              <w:t xml:space="preserve">Panoda kontaktör, termik ve faz koruma rölesi bulunmalıdır.</w:t>
-            </w:r>
-          </w:p>
-          <w:p>
-            <w:pPr>
-              <w:tabs>
-                <w:tab w:val="left" w:pos="5910"/>
-              </w:tabs>
-              <w:spacing w:line="200" w:lineRule="atLeast"/>
-              <w:jc w:val="right"/>
-              <w:cnfStyle w:val="000000000000" w:firstRow="0" w:lastRow="0" w:firstColumn="0" w:lastColumn="0" w:oddVBand="0" w:evenVBand="0" w:oddHBand="0" w:evenHBand="0" w:firstRowFirstColumn="0" w:firstRowLastColumn="0" w:lastRowFirstColumn="0" w:lastRowLastColumn="0"/>
-              <w:rPr>
-                <w:color w:val="000000" w:themeColor="text1"/>
-                <w:sz w:val="24"/>
-                <w:szCs w:val="24"/>
-              </w:rPr>
-            </w:pPr>
-            <w:r>
-              <w:rPr>
-                <w:color w:val="000000" w:themeColor="text1"/>
-                <w:sz w:val="24"/>
-                <w:szCs w:val="24"/>
-              </w:rPr>
-              <w:t xml:space="preserve">Sıcak hava dağıtımı için kümes içi branda ve hava kanalı ekipmanları fiyata dâhil olmalıdır.</w:t>
-            </w:r>
-          </w:p>
-          <w:p>
-            <w:pPr>
-              <w:tabs>
-                <w:tab w:val="left" w:pos="5910"/>
-              </w:tabs>
-              <w:spacing w:line="200" w:lineRule="atLeast"/>
-              <w:jc w:val="right"/>
-              <w:cnfStyle w:val="000000000000" w:firstRow="0" w:lastRow="0" w:firstColumn="0" w:lastColumn="0" w:oddVBand="0" w:evenVBand="0" w:oddHBand="0" w:evenHBand="0" w:firstRowFirstColumn="0" w:firstRowLastColumn="0" w:lastRowFirstColumn="0" w:lastRowLastColumn="0"/>
-              <w:rPr>
-                <w:color w:val="000000" w:themeColor="text1"/>
-                <w:sz w:val="24"/>
-                <w:szCs w:val="24"/>
-              </w:rPr>
-            </w:pPr>
-            <w:r>
-              <w:rPr>
-                <w:color w:val="000000" w:themeColor="text1"/>
-                <w:sz w:val="24"/>
-                <w:szCs w:val="24"/>
-              </w:rPr>
-              <w:t xml:space="preserve">Marka ve modele bağlı değildir; belirtilen değerleri sağlayan her ürün teklif edilebilir.</w:t>
-            </w:r>
-          </w:p>
-        </w:tc>
-        <w:tc>
-          <w:tcPr>
-            <w:tcW w:w="460" w:type="pct"/>
-          </w:tcPr>
-          <w:p>
-            <w:pPr>
-              <w:spacing w:line="160" w:lineRule="atLeast"/>
-              <w:jc w:val="center"/>
-              <w:cnfStyle w:val="000000000000" w:firstRow="0" w:lastRow="0" w:firstColumn="0" w:lastColumn="0" w:oddVBand="0" w:evenVBand="0" w:oddHBand="0" w:evenHBand="0" w:firstRowFirstColumn="0" w:firstRowLastColumn="0" w:lastRowFirstColumn="0" w:lastRowLastColumn="0"/>
-              <w:rPr>
-                <w:color w:val="000000" w:themeColor="text1"/>
-                <w:sz w:val="24"/>
-                <w:szCs w:val="24"/>
-                <w:highlight w:val="yellow"/>
-              </w:rPr>
-            </w:pPr>
-            <w:r>
-              <w:rPr>
-                <w:color w:val="000000" w:themeColor="text1"/>
-                <w:spacing w:val="-4"/>
-                <w:sz w:val="24"/>
-              </w:rPr>
-              <w:t xml:space="preserve">ADET</w:t>
-            </w:r>
-          </w:p>
-        </w:tc>
-        <w:tc>
-          <w:tcPr>
-            <w:tcW w:w="664" w:type="pct"/>
-          </w:tcPr>
-          <w:p>
-            <w:pPr>
-              <w:spacing w:line="160" w:lineRule="atLeast"/>
-              <w:ind w:left="360"/>
-              <w:jc w:val="center"/>
-              <w:cnfStyle w:val="000000000000" w:firstRow="0" w:lastRow="0" w:firstColumn="0" w:lastColumn="0" w:oddVBand="0" w:evenVBand="0" w:oddHBand="0" w:evenHBand="0" w:firstRowFirstColumn="0" w:firstRowLastColumn="0" w:lastRowFirstColumn="0" w:lastRowLastColumn="0"/>
               <w:rPr>
                 <w:color w:val="000000" w:themeColor="text1"/>
                 <w:sz w:val="24"/>

</xml_diff>